<commit_message>
Add profile photos, contact links, skill icons and card hovers
- Home hero: profile photo behind the Developer.cs code window;
  click either layer to bring it to the front
- About page portrait; photos set via profile.photo / aboutPhoto
- Contacts everywhere are Email, LinkedIn, Phone from one shared list;
  side icon rail is now fixed while scrolling
- Outline icons for every skill, brand colours on hover (react-icons)
- Shared hover effect for all cards, respecting reduced motion
- CV now includes Portfolio and LinkedIn links
- Home texts and page subtitles moved into resume.ts
- CONTENT-GUIDE.md updated for all of the above

Co-Authored-By: Claude Opus 5.5 (1M context) <noreply@anthropic.com>
</commit_message>
<xml_diff>
--- a/public/Resume-Pavan-Kalyan-Kama.docx
+++ b/public/Resume-Pavan-Kalyan-Kama.docx
@@ -619,6 +619,80 @@
     </w:p>
     <w:p>
       <w:pPr>
+        <w:spacing w:before="0" w:after="0"/>
+        <w:ind w:left="167"/>
+        <w:jc w:val="left"/>
+        <w:rPr>
+          <w:rFonts w:ascii="Times New Roman" w:hAnsi="Times New Roman" w:cs="Times New Roman"/>
+          <w:sz w:val="20"/>
+        </w:rPr>
+      </w:pPr>
+      <w:r>
+        <w:rPr>
+          <w:rFonts w:ascii="Arial" w:hAnsi="Arial" w:cs="Arial"/>
+          <w:sz w:val="22"/>
+        </w:rPr>
+        <w:t>Portfolio:</w:t>
+      </w:r>
+      <w:r>
+        <w:rPr>
+          <w:rFonts w:ascii="Times New Roman" w:hAnsi="Times New Roman" w:cs="Times New Roman"/>
+          <w:sz w:val="20"/>
+        </w:rPr>
+        <w:t xml:space="preserve"> </w:t>
+      </w:r>
+      <w:hyperlink r:id="rIdPortfolio1">
+        <w:r>
+          <w:rPr>
+            <w:rFonts w:ascii="Times New Roman" w:hAnsi="Times New Roman" w:cs="Times New Roman"/>
+            <w:color w:val="0000FF"/>
+            <w:spacing w:val="-2"/>
+            <w:sz w:val="20"/>
+            <w:u w:val="single" w:color="0000FF"/>
+          </w:rPr>
+          <w:t>https://portfolio-six-lyart-26.vercel.app/</w:t>
+        </w:r>
+      </w:hyperlink>
+    </w:p>
+    <w:p>
+      <w:pPr>
+        <w:spacing w:before="0" w:after="80"/>
+        <w:ind w:left="167"/>
+        <w:jc w:val="left"/>
+        <w:rPr>
+          <w:rFonts w:ascii="Times New Roman" w:hAnsi="Times New Roman" w:cs="Times New Roman"/>
+          <w:sz w:val="20"/>
+        </w:rPr>
+      </w:pPr>
+      <w:r>
+        <w:rPr>
+          <w:rFonts w:ascii="Arial" w:hAnsi="Arial" w:cs="Arial"/>
+          <w:sz w:val="22"/>
+        </w:rPr>
+        <w:t>LinkedIn:</w:t>
+      </w:r>
+      <w:r>
+        <w:rPr>
+          <w:rFonts w:ascii="Times New Roman" w:hAnsi="Times New Roman" w:cs="Times New Roman"/>
+          <w:sz w:val="20"/>
+        </w:rPr>
+        <w:t xml:space="preserve"> </w:t>
+      </w:r>
+      <w:hyperlink r:id="rIdLinkedin1">
+        <w:r>
+          <w:rPr>
+            <w:rFonts w:ascii="Times New Roman" w:hAnsi="Times New Roman" w:cs="Times New Roman"/>
+            <w:color w:val="0000FF"/>
+            <w:spacing w:val="-2"/>
+            <w:sz w:val="20"/>
+            <w:u w:val="single" w:color="0000FF"/>
+          </w:rPr>
+          <w:t>https://www.linkedin.com/in/pavan-kalyan-743994280/</w:t>
+        </w:r>
+      </w:hyperlink>
+    </w:p>
+    <w:p>
+      <w:pPr>
         <w:pStyle w:val="BodyText"/>
         <w:spacing w:before="166"/>
         <w:rPr>
@@ -1315,25 +1389,7 @@
           <w:sz w:val="24"/>
           <w:szCs w:val="24"/>
         </w:rPr>
-        <w:t>Dot Net Developer with around 5.</w:t>
-      </w:r>
-      <w:r>
-        <w:rPr>
-          <w:rFonts w:ascii="Times New Roman" w:hAnsi="Times New Roman" w:cs="Times New Roman"/>
-          <w:w w:val="104"/>
-          <w:sz w:val="24"/>
-          <w:szCs w:val="24"/>
-        </w:rPr>
-        <w:t>10</w:t>
-      </w:r>
-      <w:r>
-        <w:rPr>
-          <w:rFonts w:ascii="Times New Roman" w:hAnsi="Times New Roman" w:cs="Times New Roman"/>
-          <w:w w:val="104"/>
-          <w:sz w:val="24"/>
-          <w:szCs w:val="24"/>
-        </w:rPr>
-        <w:t xml:space="preserve"> years of IT experience covering all phases of the Software Design Life Cycle (SDLC) including Analysis, Design, Development, Testing, and Support of Web Applications, based on Object Oriented Programming (OOP), Client/Server, N-tier architecture, Web based and Internet Technologies. Experienced in building enterprise web applications using ASP.NET Core, Web API, Angular, and microservices/micro-frontend architectures. Skilled in translating business requirements into scalable solutions with multi-level approval workflows, role-based access control, tenant scoping, and scheduled publication features. Proficient in AI-assisted development using GitHub Copilot, Cursor, and Claude to improve productivity, code quality, and delivery speed. Worked closely with business analysts and converted the requirements into Dot Net code.</w:t>
+        <w:t xml:space="preserve">Dot Net Developer with around 5.10 years of IT experience covering all phases of the Software Design Life Cycle (SDLC) including Analysis, Design, Development, Testing, and Support of Web Applications, based on Object Oriented Programming (OOP), Client/Server, N-tier architecture, Web based and Internet Technologies. Experienced in building enterprise web applications using ASP.NET Core, Web API, Angular, and microservices/micro-frontend architectures. Skilled in translating business requirements into scalable solutions with multi-level approval workflows, role-based access control, tenant scoping, and scheduled publication features. Proficient in AI-assisted development using GitHub Copilot, Cursor, and Claude to improve productivity, code quality, and delivery speed. Worked closely with business analysts and converted the requirements into Dot Net code.</w:t>
       </w:r>
     </w:p>
     <w:p>
@@ -2442,18 +2498,6 @@
           <w:lang w:val="en-IN"/>
         </w:rPr>
         <w:t>Education :</w:t>
-      </w:r>
-      <w:r>
-        <w:rPr>
-          <w:rFonts w:ascii="Times New Roman" w:hAnsi="Times New Roman" w:cs="Times New Roman"/>
-          <w:b/>
-          <w:bCs/>
-          <w:spacing w:val="-5"/>
-          <w:sz w:val="24"/>
-          <w:szCs w:val="24"/>
-          <w:u w:val="single"/>
-          <w:lang w:val="en-IN"/>
-        </w:rPr>
         <w:br/>
       </w:r>
     </w:p>
@@ -2575,13 +2619,6 @@
           <w:sz w:val="20"/>
         </w:rPr>
         <w:br/>
-      </w:r>
-      <w:r>
-        <w:rPr>
-          <w:rFonts w:ascii="Times New Roman" w:hAnsi="Times New Roman" w:cs="Times New Roman"/>
-          <w:noProof/>
-          <w:sz w:val="20"/>
-        </w:rPr>
         <w:drawing>
           <wp:anchor distT="0" distB="0" distL="0" distR="0" simplePos="0" relativeHeight="6" behindDoc="1" locked="0" layoutInCell="1" allowOverlap="1" wp14:anchorId="5568B0EC" wp14:editId="2C583DFA">
             <wp:simplePos x="0" y="0"/>
@@ -2624,13 +2661,6 @@
             </a:graphic>
           </wp:anchor>
         </w:drawing>
-      </w:r>
-      <w:r>
-        <w:rPr>
-          <w:rFonts w:ascii="Times New Roman" w:hAnsi="Times New Roman" w:cs="Times New Roman"/>
-          <w:noProof/>
-          <w:sz w:val="20"/>
-        </w:rPr>
         <w:t>Worked</w:t>
       </w:r>
       <w:r>
@@ -2818,18 +2848,6 @@
         </w:rPr>
         <w:lastRenderedPageBreak/>
         <w:t>Project Undertaken :</w:t>
-      </w:r>
-      <w:r>
-        <w:rPr>
-          <w:rFonts w:ascii="Times New Roman" w:hAnsi="Times New Roman" w:cs="Times New Roman"/>
-          <w:b/>
-          <w:bCs/>
-          <w:spacing w:val="-5"/>
-          <w:sz w:val="24"/>
-          <w:szCs w:val="24"/>
-          <w:u w:val="single"/>
-          <w:lang w:val="en-IN"/>
-        </w:rPr>
         <w:br/>
       </w:r>
     </w:p>
@@ -2936,15 +2954,6 @@
           <w:szCs w:val="24"/>
         </w:rPr>
         <w:t>Description : CM-Core (CM 2.0) is an enterprise campaign management platform for digital asset and template library management, multi-level approval workflows, and scheduled publication of marketing content. The solution uses a micro-frontend architecture with Angular Nx remotes (Library, Approvals, Campaigns, Dashboard) integrated with .NET microservices (Auth, Core, Campaign). It supports tenant-scoped access control, approval policies, publish-now/publish-later scheduling, effective date validation, and automatic content expiration.</w:t>
-      </w:r>
-      <w:r>
-        <w:rPr>
-          <w:rFonts w:ascii="Times New Roman" w:hAnsi="Times New Roman" w:cs="Times New Roman"/>
-          <w:b/>
-          <w:bCs/>
-          <w:sz w:val="24"/>
-          <w:szCs w:val="24"/>
-        </w:rPr>
         <w:br/>
         <w:t xml:space="preserve"> </w:t>
       </w:r>
@@ -3310,13 +3319,6 @@
           <w:szCs w:val="24"/>
         </w:rPr>
         <w:t xml:space="preserve">: iPay-BillPay is a banking application which is under Jack Henry Associations. The Associations addresses the trade finance, lending, payments, limits, collateral's, treasury, deposits, liquidity management, online banking and mobile banking requirements of corporate banks worldwide and enables them to deliver customized offerings to enterprise clients of all sizes. It provides services to different type of banking like retail banking, corporate banking. The most of the world’s leading banks choose Online Banking to offer more features to their customers. Retail customers get full </w:t>
-      </w:r>
-      <w:r>
-        <w:rPr>
-          <w:rFonts w:ascii="Times New Roman" w:hAnsi="Times New Roman" w:cs="Times New Roman"/>
-          <w:sz w:val="24"/>
-          <w:szCs w:val="24"/>
-        </w:rPr>
         <w:lastRenderedPageBreak/>
         <w:t>visibility into all their banking accounts and are enabled to transfer and schedule recurring payments safely. As well as corporate customers can manage their unique cash management policies to manage receivables, payables, account services and investments, efficiently.</w:t>
       </w:r>

</xml_diff>